<commit_message>
Added 1 feedback comment
</commit_message>
<xml_diff>
--- a/Project Step 3-Final.docx
+++ b/Project Step 3-Final.docx
@@ -3893,8 +3893,6 @@
           <w:szCs w:val="20"/>
         </w:rPr>
       </w:pPr>
-      <w:bookmarkStart w:id="3" w:name="_GoBack"/>
-      <w:bookmarkEnd w:id="3"/>
     </w:p>
     <w:p>
       <w:pPr>
@@ -5066,6 +5064,54 @@
     </w:p>
     <w:p>
       <w:pPr>
+        <w:pStyle w:val="ListParagraph"/>
+        <w:numPr>
+          <w:ilvl w:val="1"/>
+          <w:numId w:val="8"/>
+        </w:numPr>
+        <w:shd w:val="clear" w:color="auto" w:fill="FFFFFF"/>
+        <w:spacing w:before="180" w:after="180" w:line="360" w:lineRule="auto"/>
+        <w:rPr>
+          <w:bCs/>
+        </w:rPr>
+      </w:pPr>
+      <w:r>
+        <w:rPr>
+          <w:rFonts w:ascii="Helvetica" w:hAnsi="Helvetica" w:cs="Helvetica"/>
+          <w:color w:val="273540"/>
+          <w:shd w:val="clear" w:color="auto" w:fill="FFFFFF"/>
+        </w:rPr>
+        <w:t xml:space="preserve">Followed </w:t>
+      </w:r>
+      <w:r>
+        <w:rPr>
+          <w:rFonts w:ascii="Helvetica" w:hAnsi="Helvetica" w:cs="Helvetica"/>
+          <w:color w:val="273540"/>
+          <w:shd w:val="clear" w:color="auto" w:fill="FFFFFF"/>
+        </w:rPr>
+        <w:t xml:space="preserve">Cody </w:t>
+      </w:r>
+      <w:proofErr w:type="spellStart"/>
+      <w:r>
+        <w:rPr>
+          <w:rFonts w:ascii="Helvetica" w:hAnsi="Helvetica" w:cs="Helvetica"/>
+          <w:color w:val="273540"/>
+          <w:shd w:val="clear" w:color="auto" w:fill="FFFFFF"/>
+        </w:rPr>
+        <w:t>Strehlow</w:t>
+      </w:r>
+      <w:proofErr w:type="spellEnd"/>
+      <w:r>
+        <w:rPr>
+          <w:rFonts w:ascii="Helvetica" w:hAnsi="Helvetica" w:cs="Helvetica"/>
+          <w:color w:val="273540"/>
+          <w:shd w:val="clear" w:color="auto" w:fill="FFFFFF"/>
+        </w:rPr>
+        <w:t xml:space="preserve"> advice and added junction tables</w:t>
+      </w:r>
+    </w:p>
+    <w:p>
+      <w:pPr>
         <w:pStyle w:val="Heading4"/>
         <w:keepNext w:val="0"/>
         <w:keepLines w:val="0"/>
@@ -5098,10 +5144,10 @@
         <w:shd w:val="clear" w:color="auto" w:fill="FFFFFF"/>
         <w:spacing w:before="180" w:after="180" w:line="360" w:lineRule="auto"/>
       </w:pPr>
-      <w:bookmarkStart w:id="4" w:name="_6w1db9kklrvw" w:colFirst="0" w:colLast="0"/>
-      <w:bookmarkStart w:id="5" w:name="_7331iubknh" w:colFirst="0" w:colLast="0"/>
+      <w:bookmarkStart w:id="3" w:name="_6w1db9kklrvw" w:colFirst="0" w:colLast="0"/>
+      <w:bookmarkStart w:id="4" w:name="_7331iubknh" w:colFirst="0" w:colLast="0"/>
+      <w:bookmarkEnd w:id="3"/>
       <w:bookmarkEnd w:id="4"/>
-      <w:bookmarkEnd w:id="5"/>
       <w:r>
         <w:t>Draft 2</w:t>
       </w:r>
@@ -5253,6 +5299,45 @@
       <w:r>
         <w:t>Included URL to home page index.</w:t>
       </w:r>
+    </w:p>
+    <w:p>
+      <w:pPr>
+        <w:pStyle w:val="ListParagraph"/>
+        <w:numPr>
+          <w:ilvl w:val="1"/>
+          <w:numId w:val="7"/>
+        </w:numPr>
+        <w:shd w:val="clear" w:color="auto" w:fill="FFFFFF"/>
+        <w:spacing w:before="180" w:after="180" w:line="360" w:lineRule="auto"/>
+        <w:rPr>
+          <w:bCs/>
+        </w:rPr>
+      </w:pPr>
+      <w:r>
+        <w:rPr>
+          <w:color w:val="273540"/>
+        </w:rPr>
+        <w:t xml:space="preserve">Adjusted route handler to add sample data to pages this caused the Delete button to appear. </w:t>
+      </w:r>
+      <w:bookmarkStart w:id="5" w:name="_GoBack"/>
+      <w:bookmarkEnd w:id="5"/>
+    </w:p>
+    <w:p>
+      <w:pPr>
+        <w:pStyle w:val="ListParagraph"/>
+        <w:numPr>
+          <w:ilvl w:val="1"/>
+          <w:numId w:val="7"/>
+        </w:numPr>
+        <w:shd w:val="clear" w:color="auto" w:fill="FFFFFF"/>
+        <w:spacing w:before="180" w:after="180" w:line="360" w:lineRule="auto"/>
+        <w:rPr>
+          <w:color w:val="273540"/>
+          <w:sz w:val="28"/>
+          <w:szCs w:val="28"/>
+          <w:u w:val="single"/>
+        </w:rPr>
+      </w:pPr>
       <w:r>
         <w:rPr>
           <w:color w:val="273540"/>

</xml_diff>